<commit_message>
Knowledge - 5/18/2026 part 4
</commit_message>
<xml_diff>
--- a/Knowledge/3-Work knowledge/1-Software Engineering/4-Web Development/2-Frontend/2-Core Technologies/1-HTML/3-HTML Body Elements/13-HTML Graphics Elements.docx
+++ b/Knowledge/3-Work knowledge/1-Software Engineering/4-Web Development/2-Frontend/2-Core Technologies/1-HTML/3-HTML Body Elements/13-HTML Graphics Elements.docx
@@ -192,7 +192,7 @@
           <w:rFonts w:ascii="Roboto Mono" w:hAnsi="Roboto Mono"/>
         </w:rPr>
         <w:pict w14:anchorId="1E57B943">
-          <v:rect id="_x0000_i1025" style="width:0;height:1.5pt" o:hralign="center" o:hrstd="t" o:hr="t" fillcolor="#a0a0a0" stroked="f"/>
+          <v:rect id="_x0000_i1026" style="width:0;height:1.5pt" o:hralign="center" o:hrstd="t" o:hr="t" fillcolor="#a0a0a0" stroked="f"/>
         </w:pict>
       </w:r>
     </w:p>
@@ -555,7 +555,7 @@
           <w:rFonts w:ascii="Roboto Mono" w:hAnsi="Roboto Mono"/>
         </w:rPr>
         <w:pict w14:anchorId="266B0314">
-          <v:rect id="_x0000_i1026" style="width:0;height:1.5pt" o:hralign="center" o:hrstd="t" o:hr="t" fillcolor="#a0a0a0" stroked="f"/>
+          <v:rect id="_x0000_i1027" style="width:0;height:1.5pt" o:hralign="center" o:hrstd="t" o:hr="t" fillcolor="#a0a0a0" stroked="f"/>
         </w:pict>
       </w:r>
     </w:p>
@@ -945,7 +945,7 @@
           <w:rFonts w:ascii="Roboto Mono" w:hAnsi="Roboto Mono"/>
         </w:rPr>
         <w:pict w14:anchorId="2DB0423F">
-          <v:rect id="_x0000_i1027" style="width:0;height:1.5pt" o:hralign="center" o:hrstd="t" o:hr="t" fillcolor="#a0a0a0" stroked="f"/>
+          <v:rect id="_x0000_i1028" style="width:0;height:1.5pt" o:hralign="center" o:hrstd="t" o:hr="t" fillcolor="#a0a0a0" stroked="f"/>
         </w:pict>
       </w:r>
     </w:p>
@@ -1062,7 +1062,6 @@
         <w:t xml:space="preserve">let c = </w:t>
       </w:r>
       <w:proofErr w:type="spellStart"/>
-      <w:proofErr w:type="gramStart"/>
       <w:r>
         <w:rPr>
           <w:rFonts w:ascii="Roboto Mono" w:hAnsi="Roboto Mono"/>
@@ -1070,7 +1069,6 @@
         <w:t>document.getElementById</w:t>
       </w:r>
       <w:proofErr w:type="spellEnd"/>
-      <w:proofErr w:type="gramEnd"/>
       <w:r>
         <w:rPr>
           <w:rFonts w:ascii="Roboto Mono" w:hAnsi="Roboto Mono"/>
@@ -1113,7 +1111,6 @@
         <w:t xml:space="preserve"> = </w:t>
       </w:r>
       <w:proofErr w:type="spellStart"/>
-      <w:proofErr w:type="gramStart"/>
       <w:r>
         <w:rPr>
           <w:rFonts w:ascii="Roboto Mono" w:hAnsi="Roboto Mono"/>
@@ -1121,7 +1118,6 @@
         <w:t>c.getContext</w:t>
       </w:r>
       <w:proofErr w:type="spellEnd"/>
-      <w:proofErr w:type="gramEnd"/>
       <w:r>
         <w:rPr>
           <w:rFonts w:ascii="Roboto Mono" w:hAnsi="Roboto Mono"/>
@@ -1141,7 +1137,6 @@
         <w:br/>
       </w:r>
       <w:proofErr w:type="spellStart"/>
-      <w:proofErr w:type="gramStart"/>
       <w:r>
         <w:rPr>
           <w:rFonts w:ascii="Roboto Mono" w:hAnsi="Roboto Mono"/>
@@ -1150,7 +1145,6 @@
         <w:t>ctx.fillStyle</w:t>
       </w:r>
       <w:proofErr w:type="spellEnd"/>
-      <w:proofErr w:type="gramEnd"/>
       <w:r>
         <w:rPr>
           <w:rFonts w:ascii="Roboto Mono" w:hAnsi="Roboto Mono"/>
@@ -1164,7 +1158,6 @@
         <w:br/>
       </w:r>
       <w:proofErr w:type="spellStart"/>
-      <w:proofErr w:type="gramStart"/>
       <w:r>
         <w:rPr>
           <w:rFonts w:ascii="Roboto Mono" w:hAnsi="Roboto Mono"/>
@@ -1172,7 +1165,6 @@
         <w:t>ctx.fillRect</w:t>
       </w:r>
       <w:proofErr w:type="spellEnd"/>
-      <w:proofErr w:type="gramEnd"/>
       <w:r>
         <w:rPr>
           <w:rFonts w:ascii="Roboto Mono" w:hAnsi="Roboto Mono"/>
@@ -1204,7 +1196,7 @@
           <w:rFonts w:ascii="Roboto Mono" w:hAnsi="Roboto Mono"/>
         </w:rPr>
         <w:pict w14:anchorId="5DEA3DD5">
-          <v:rect id="_x0000_i1028" style="width:0;height:1.5pt" o:hralign="center" o:hrstd="t" o:hr="t" fillcolor="#a0a0a0" stroked="f"/>
+          <v:rect id="_x0000_i1029" style="width:0;height:1.5pt" o:hralign="center" o:hrstd="t" o:hr="t" fillcolor="#a0a0a0" stroked="f"/>
         </w:pict>
       </w:r>
     </w:p>
@@ -1430,7 +1422,7 @@
           <w:rFonts w:ascii="Roboto Mono" w:hAnsi="Roboto Mono"/>
         </w:rPr>
         <w:pict w14:anchorId="7E52F123">
-          <v:rect id="_x0000_i1029" style="width:0;height:1.5pt" o:hralign="center" o:hrstd="t" o:hr="t" fillcolor="#a0a0a0" stroked="f"/>
+          <v:rect id="_x0000_i1030" style="width:0;height:1.5pt" o:hralign="center" o:hrstd="t" o:hr="t" fillcolor="#a0a0a0" stroked="f"/>
         </w:pict>
       </w:r>
     </w:p>
@@ -1690,7 +1682,7 @@
           <w:rFonts w:ascii="Roboto Mono" w:hAnsi="Roboto Mono"/>
         </w:rPr>
         <w:pict w14:anchorId="5F5310A7">
-          <v:rect id="_x0000_i1701" style="width:0;height:1.5pt" o:hralign="center" o:bullet="t" o:hrstd="t" o:hr="t" fillcolor="#a0a0a0" stroked="f"/>
+          <v:rect id="_x0000_i1031" style="width:0;height:1.5pt" o:hralign="center" o:bullet="t" o:hrstd="t" o:hr="t" fillcolor="#a0a0a0" stroked="f"/>
         </w:pict>
       </w:r>
     </w:p>
@@ -2616,16 +2608,8 @@
               <w:rPr>
                 <w:rFonts w:ascii="Roboto Mono" w:hAnsi="Roboto Mono"/>
               </w:rPr>
-              <w:t xml:space="preserve">Quality When </w:t>
+              <w:t>Quality When Zooming</w:t>
             </w:r>
-            <w:proofErr w:type="gramStart"/>
-            <w:r>
-              <w:rPr>
-                <w:rFonts w:ascii="Roboto Mono" w:hAnsi="Roboto Mono"/>
-              </w:rPr>
-              <w:t>Zooming</w:t>
-            </w:r>
-            <w:proofErr w:type="gramEnd"/>
           </w:p>
         </w:tc>
         <w:tc>
@@ -3339,7 +3323,7 @@
           <w:rFonts w:ascii="Roboto Mono" w:hAnsi="Roboto Mono"/>
         </w:rPr>
         <w:pict w14:anchorId="4E7F6FEB">
-          <v:rect id="_x0000_i1714" style="width:0;height:1.5pt" o:hralign="center" o:hrstd="t" o:hr="t" fillcolor="#a0a0a0" stroked="f"/>
+          <v:rect id="_x0000_i1032" style="width:0;height:1.5pt" o:hralign="center" o:hrstd="t" o:hr="t" fillcolor="#a0a0a0" stroked="f"/>
         </w:pict>
       </w:r>
     </w:p>
@@ -3668,7 +3652,7 @@
           <w:rFonts w:ascii="Roboto Mono" w:hAnsi="Roboto Mono"/>
         </w:rPr>
         <w:pict w14:anchorId="2DCC6132">
-          <v:rect id="_x0000_i1712" style="width:0;height:1.5pt" o:hralign="center" o:hrstd="t" o:hr="t" fillcolor="#a0a0a0" stroked="f"/>
+          <v:rect id="_x0000_i1033" style="width:0;height:1.5pt" o:hralign="center" o:hrstd="t" o:hr="t" fillcolor="#a0a0a0" stroked="f"/>
         </w:pict>
       </w:r>
     </w:p>
@@ -4073,6 +4057,7 @@
       <w:r>
         <w:rPr>
           <w:rFonts w:ascii="Roboto Mono" w:hAnsi="Roboto Mono"/>
+          <w:noProof/>
         </w:rPr>
         <w:drawing>
           <wp:inline distT="0" distB="0" distL="0" distR="0" wp14:anchorId="40AAC32E" wp14:editId="211375BA">
@@ -4133,6 +4118,7 @@
       <w:r>
         <w:rPr>
           <w:rFonts w:ascii="Roboto Mono" w:hAnsi="Roboto Mono"/>
+          <w:noProof/>
         </w:rPr>
         <w:lastRenderedPageBreak/>
         <w:drawing>
@@ -4194,6 +4180,7 @@
       <w:r>
         <w:rPr>
           <w:rFonts w:ascii="Roboto Mono" w:hAnsi="Roboto Mono"/>
+          <w:noProof/>
         </w:rPr>
         <w:drawing>
           <wp:inline distT="0" distB="0" distL="0" distR="0" wp14:anchorId="31FCB162" wp14:editId="1DD4E4C7">
@@ -4269,7 +4256,7 @@
           <w:rFonts w:ascii="Roboto Mono" w:hAnsi="Roboto Mono"/>
         </w:rPr>
         <w:pict w14:anchorId="462DC2A9">
-          <v:rect id="_x0000_i1775" style="width:0;height:1.5pt" o:hralign="center" o:hrstd="t" o:hr="t" fillcolor="#a0a0a0" stroked="f"/>
+          <v:rect id="_x0000_i1034" style="width:0;height:1.5pt" o:hralign="center" o:hrstd="t" o:hr="t" fillcolor="#a0a0a0" stroked="f"/>
         </w:pict>
       </w:r>
     </w:p>
@@ -4429,7 +4416,7 @@
           <w:rFonts w:ascii="Roboto Mono" w:hAnsi="Roboto Mono"/>
         </w:rPr>
         <w:pict w14:anchorId="41D52576">
-          <v:rect id="_x0000_i1777" style="width:0;height:1.5pt" o:hralign="center" o:hrstd="t" o:hr="t" fillcolor="#a0a0a0" stroked="f"/>
+          <v:rect id="_x0000_i1035" style="width:0;height:1.5pt" o:hralign="center" o:hrstd="t" o:hr="t" fillcolor="#a0a0a0" stroked="f"/>
         </w:pict>
       </w:r>
     </w:p>
@@ -4574,7 +4561,7 @@
           <w:rFonts w:ascii="Roboto Mono" w:hAnsi="Roboto Mono"/>
         </w:rPr>
         <w:pict w14:anchorId="290AFE47">
-          <v:rect id="_x0000_i1778" style="width:0;height:1.5pt" o:hralign="center" o:hrstd="t" o:hr="t" fillcolor="#a0a0a0" stroked="f"/>
+          <v:rect id="_x0000_i1036" style="width:0;height:1.5pt" o:hralign="center" o:hrstd="t" o:hr="t" fillcolor="#a0a0a0" stroked="f"/>
         </w:pict>
       </w:r>
     </w:p>
@@ -4719,7 +4706,7 @@
           <w:rFonts w:ascii="Roboto Mono" w:hAnsi="Roboto Mono"/>
         </w:rPr>
         <w:pict w14:anchorId="25C9BE8A">
-          <v:rect id="_x0000_i1779" style="width:0;height:1.5pt" o:hralign="center" o:hrstd="t" o:hr="t" fillcolor="#a0a0a0" stroked="f"/>
+          <v:rect id="_x0000_i1037" style="width:0;height:1.5pt" o:hralign="center" o:hrstd="t" o:hr="t" fillcolor="#a0a0a0" stroked="f"/>
         </w:pict>
       </w:r>
     </w:p>
@@ -4864,7 +4851,7 @@
           <w:rFonts w:ascii="Roboto Mono" w:hAnsi="Roboto Mono"/>
         </w:rPr>
         <w:pict w14:anchorId="479F7851">
-          <v:rect id="_x0000_i1780" style="width:0;height:1.5pt" o:hralign="center" o:hrstd="t" o:hr="t" fillcolor="#a0a0a0" stroked="f"/>
+          <v:rect id="_x0000_i1038" style="width:0;height:1.5pt" o:hralign="center" o:hrstd="t" o:hr="t" fillcolor="#a0a0a0" stroked="f"/>
         </w:pict>
       </w:r>
     </w:p>
@@ -5304,7 +5291,7 @@
           <w:rFonts w:ascii="Roboto Mono" w:hAnsi="Roboto Mono"/>
         </w:rPr>
         <w:pict w14:anchorId="4BD7A081">
-          <v:rect id="_x0000_i1781" style="width:0;height:1.5pt" o:hralign="center" o:hrstd="t" o:hr="t" fillcolor="#a0a0a0" stroked="f"/>
+          <v:rect id="_x0000_i1039" style="width:0;height:1.5pt" o:hralign="center" o:hrstd="t" o:hr="t" fillcolor="#a0a0a0" stroked="f"/>
         </w:pict>
       </w:r>
     </w:p>
@@ -5528,7 +5515,7 @@
           <w:rFonts w:ascii="Roboto Mono" w:hAnsi="Roboto Mono"/>
         </w:rPr>
         <w:pict w14:anchorId="33A88BB3">
-          <v:rect id="_x0000_i1031" style="width:0;height:1.5pt" o:hralign="center" o:hrstd="t" o:hr="t" fillcolor="#a0a0a0" stroked="f"/>
+          <v:rect id="_x0000_i1040" style="width:0;height:1.5pt" o:hralign="center" o:hrstd="t" o:hr="t" fillcolor="#a0a0a0" stroked="f"/>
         </w:pict>
       </w:r>
     </w:p>
@@ -5962,21 +5949,7 @@
         <w:rPr>
           <w:rFonts w:ascii="Roboto Mono" w:hAnsi="Roboto Mono"/>
         </w:rPr>
-        <w:t xml:space="preserve">    </w:t>
-      </w:r>
-      <w:proofErr w:type="gramStart"/>
-      <w:r>
-        <w:rPr>
-          <w:rFonts w:ascii="Roboto Mono" w:hAnsi="Roboto Mono"/>
-        </w:rPr>
-        <w:t>&lt;!--</w:t>
-      </w:r>
-      <w:proofErr w:type="gramEnd"/>
-      <w:r>
-        <w:rPr>
-          <w:rFonts w:ascii="Roboto Mono" w:hAnsi="Roboto Mono"/>
-        </w:rPr>
-        <w:t xml:space="preserve"> Canvas --&gt;</w:t>
+        <w:t xml:space="preserve">    &lt;!-- Canvas --&gt;</w:t>
       </w:r>
     </w:p>
     <w:p>
@@ -6119,7 +6092,6 @@
         <w:t xml:space="preserve">        let c = </w:t>
       </w:r>
       <w:proofErr w:type="spellStart"/>
-      <w:proofErr w:type="gramStart"/>
       <w:r>
         <w:rPr>
           <w:rFonts w:ascii="Roboto Mono" w:hAnsi="Roboto Mono"/>
@@ -6127,7 +6099,6 @@
         <w:t>document.getElementById</w:t>
       </w:r>
       <w:proofErr w:type="spellEnd"/>
-      <w:proofErr w:type="gramEnd"/>
       <w:r>
         <w:rPr>
           <w:rFonts w:ascii="Roboto Mono" w:hAnsi="Roboto Mono"/>
@@ -6176,7 +6147,6 @@
         <w:t xml:space="preserve"> = </w:t>
       </w:r>
       <w:proofErr w:type="spellStart"/>
-      <w:proofErr w:type="gramStart"/>
       <w:r>
         <w:rPr>
           <w:rFonts w:ascii="Roboto Mono" w:hAnsi="Roboto Mono"/>
@@ -6184,7 +6154,6 @@
         <w:t>c.getContext</w:t>
       </w:r>
       <w:proofErr w:type="spellEnd"/>
-      <w:proofErr w:type="gramEnd"/>
       <w:r>
         <w:rPr>
           <w:rFonts w:ascii="Roboto Mono" w:hAnsi="Roboto Mono"/>
@@ -6212,7 +6181,6 @@
         <w:t xml:space="preserve">        </w:t>
       </w:r>
       <w:proofErr w:type="spellStart"/>
-      <w:proofErr w:type="gramStart"/>
       <w:r>
         <w:rPr>
           <w:rFonts w:ascii="Roboto Mono" w:hAnsi="Roboto Mono"/>
@@ -6220,7 +6188,6 @@
         <w:t>ctx.fillStyle</w:t>
       </w:r>
       <w:proofErr w:type="spellEnd"/>
-      <w:proofErr w:type="gramEnd"/>
       <w:r>
         <w:rPr>
           <w:rFonts w:ascii="Roboto Mono" w:hAnsi="Roboto Mono"/>
@@ -6241,7 +6208,6 @@
         <w:t xml:space="preserve">        </w:t>
       </w:r>
       <w:proofErr w:type="spellStart"/>
-      <w:proofErr w:type="gramStart"/>
       <w:r>
         <w:rPr>
           <w:rFonts w:ascii="Roboto Mono" w:hAnsi="Roboto Mono"/>
@@ -6249,7 +6215,6 @@
         <w:t>ctx.fillRect</w:t>
       </w:r>
       <w:proofErr w:type="spellEnd"/>
-      <w:proofErr w:type="gramEnd"/>
       <w:r>
         <w:rPr>
           <w:rFonts w:ascii="Roboto Mono" w:hAnsi="Roboto Mono"/>
@@ -6294,21 +6259,7 @@
         <w:rPr>
           <w:rFonts w:ascii="Roboto Mono" w:hAnsi="Roboto Mono"/>
         </w:rPr>
-        <w:t xml:space="preserve">    </w:t>
-      </w:r>
-      <w:proofErr w:type="gramStart"/>
-      <w:r>
-        <w:rPr>
-          <w:rFonts w:ascii="Roboto Mono" w:hAnsi="Roboto Mono"/>
-        </w:rPr>
-        <w:t>&lt;!--</w:t>
-      </w:r>
-      <w:proofErr w:type="gramEnd"/>
-      <w:r>
-        <w:rPr>
-          <w:rFonts w:ascii="Roboto Mono" w:hAnsi="Roboto Mono"/>
-        </w:rPr>
-        <w:t xml:space="preserve"> SVG --&gt;</w:t>
+        <w:t xml:space="preserve">    &lt;!-- SVG --&gt;</w:t>
       </w:r>
     </w:p>
     <w:p>
@@ -6871,21 +6822,7 @@
         <w:rPr>
           <w:rFonts w:ascii="Roboto Mono" w:hAnsi="Roboto Mono"/>
         </w:rPr>
-        <w:t xml:space="preserve">    </w:t>
-      </w:r>
-      <w:proofErr w:type="gramStart"/>
-      <w:r>
-        <w:rPr>
-          <w:rFonts w:ascii="Roboto Mono" w:hAnsi="Roboto Mono"/>
-        </w:rPr>
-        <w:t>&lt;!--</w:t>
-      </w:r>
-      <w:proofErr w:type="gramEnd"/>
-      <w:r>
-        <w:rPr>
-          <w:rFonts w:ascii="Roboto Mono" w:hAnsi="Roboto Mono"/>
-        </w:rPr>
-        <w:t xml:space="preserve"> Canvas --&gt;</w:t>
+        <w:t>    &lt;!-- Canvas --&gt;</w:t>
       </w:r>
     </w:p>
     <w:p>
@@ -7027,7 +6964,6 @@
         <w:t xml:space="preserve">        let c = </w:t>
       </w:r>
       <w:proofErr w:type="spellStart"/>
-      <w:proofErr w:type="gramStart"/>
       <w:r>
         <w:rPr>
           <w:rFonts w:ascii="Roboto Mono" w:hAnsi="Roboto Mono"/>
@@ -7035,7 +6971,6 @@
         <w:t>document.getElementById</w:t>
       </w:r>
       <w:proofErr w:type="spellEnd"/>
-      <w:proofErr w:type="gramEnd"/>
       <w:r>
         <w:rPr>
           <w:rFonts w:ascii="Roboto Mono" w:hAnsi="Roboto Mono"/>
@@ -7084,7 +7019,6 @@
         <w:t xml:space="preserve"> = </w:t>
       </w:r>
       <w:proofErr w:type="spellStart"/>
-      <w:proofErr w:type="gramStart"/>
       <w:r>
         <w:rPr>
           <w:rFonts w:ascii="Roboto Mono" w:hAnsi="Roboto Mono"/>
@@ -7092,7 +7026,6 @@
         <w:t>c.getContext</w:t>
       </w:r>
       <w:proofErr w:type="spellEnd"/>
-      <w:proofErr w:type="gramEnd"/>
       <w:r>
         <w:rPr>
           <w:rFonts w:ascii="Roboto Mono" w:hAnsi="Roboto Mono"/>
@@ -7121,7 +7054,6 @@
         <w:t xml:space="preserve">        </w:t>
       </w:r>
       <w:proofErr w:type="spellStart"/>
-      <w:proofErr w:type="gramStart"/>
       <w:r>
         <w:rPr>
           <w:rFonts w:ascii="Roboto Mono" w:hAnsi="Roboto Mono"/>
@@ -7129,7 +7061,6 @@
         <w:t>ctx.fillStyle</w:t>
       </w:r>
       <w:proofErr w:type="spellEnd"/>
-      <w:proofErr w:type="gramEnd"/>
       <w:r>
         <w:rPr>
           <w:rFonts w:ascii="Roboto Mono" w:hAnsi="Roboto Mono"/>
@@ -7150,7 +7081,6 @@
         <w:t xml:space="preserve">        </w:t>
       </w:r>
       <w:proofErr w:type="spellStart"/>
-      <w:proofErr w:type="gramStart"/>
       <w:r>
         <w:rPr>
           <w:rFonts w:ascii="Roboto Mono" w:hAnsi="Roboto Mono"/>
@@ -7158,7 +7088,6 @@
         <w:t>ctx.fillRect</w:t>
       </w:r>
       <w:proofErr w:type="spellEnd"/>
-      <w:proofErr w:type="gramEnd"/>
       <w:r>
         <w:rPr>
           <w:rFonts w:ascii="Roboto Mono" w:hAnsi="Roboto Mono"/>
@@ -7203,21 +7132,7 @@
         <w:rPr>
           <w:rFonts w:ascii="Roboto Mono" w:hAnsi="Roboto Mono"/>
         </w:rPr>
-        <w:t xml:space="preserve">    </w:t>
-      </w:r>
-      <w:proofErr w:type="gramStart"/>
-      <w:r>
-        <w:rPr>
-          <w:rFonts w:ascii="Roboto Mono" w:hAnsi="Roboto Mono"/>
-        </w:rPr>
-        <w:t>&lt;!--</w:t>
-      </w:r>
-      <w:proofErr w:type="gramEnd"/>
-      <w:r>
-        <w:rPr>
-          <w:rFonts w:ascii="Roboto Mono" w:hAnsi="Roboto Mono"/>
-        </w:rPr>
-        <w:t xml:space="preserve"> SVG --&gt;</w:t>
+        <w:t>    &lt;!-- SVG --&gt;</w:t>
       </w:r>
     </w:p>
     <w:p>
@@ -7485,7 +7400,7 @@
           <w:rFonts w:ascii="Roboto Mono" w:hAnsi="Roboto Mono"/>
         </w:rPr>
         <w:pict w14:anchorId="61CF28AD">
-          <v:rect id="_x0000_i1032" style="width:0;height:1.5pt" o:hralign="center" o:hrstd="t" o:hr="t" fillcolor="#a0a0a0" stroked="f"/>
+          <v:rect id="_x0000_i1041" style="width:0;height:1.5pt" o:hralign="center" o:hrstd="t" o:hr="t" fillcolor="#a0a0a0" stroked="f"/>
         </w:pict>
       </w:r>
     </w:p>
@@ -7796,7 +7711,7 @@
           <w:rFonts w:ascii="Roboto Mono" w:hAnsi="Roboto Mono"/>
         </w:rPr>
         <w:pict w14:anchorId="23E597EA">
-          <v:rect id="_x0000_i1033" style="width:0;height:1.5pt" o:hralign="center" o:hrstd="t" o:hr="t" fillcolor="#a0a0a0" stroked="f"/>
+          <v:rect id="_x0000_i1042" style="width:0;height:1.5pt" o:hralign="center" o:hrstd="t" o:hr="t" fillcolor="#a0a0a0" stroked="f"/>
         </w:pict>
       </w:r>
     </w:p>
@@ -8069,7 +7984,7 @@
           <w:rFonts w:ascii="Roboto Mono" w:hAnsi="Roboto Mono"/>
         </w:rPr>
         <w:pict w14:anchorId="5767751F">
-          <v:rect id="_x0000_i1190" style="width:0;height:1.5pt" o:hralign="center" o:hrstd="t" o:hr="t" fillcolor="#a0a0a0" stroked="f"/>
+          <v:rect id="_x0000_i1043" style="width:0;height:1.5pt" o:hralign="center" o:hrstd="t" o:hr="t" fillcolor="#a0a0a0" stroked="f"/>
         </w:pict>
       </w:r>
     </w:p>
@@ -8334,7 +8249,6 @@
               </w:rPr>
             </w:pPr>
             <w:proofErr w:type="spellStart"/>
-            <w:proofErr w:type="gramStart"/>
             <w:r>
               <w:rPr>
                 <w:rFonts w:ascii="Roboto Mono" w:hAnsi="Roboto Mono"/>
@@ -8346,14 +8260,7 @@
               <w:rPr>
                 <w:rFonts w:ascii="Roboto Mono" w:hAnsi="Roboto Mono"/>
               </w:rPr>
-              <w:t>(</w:t>
-            </w:r>
-            <w:proofErr w:type="gramEnd"/>
-            <w:r>
-              <w:rPr>
-                <w:rFonts w:ascii="Roboto Mono" w:hAnsi="Roboto Mono"/>
-              </w:rPr>
-              <w:t>)</w:t>
+              <w:t>()</w:t>
             </w:r>
           </w:p>
         </w:tc>
@@ -8395,7 +8302,6 @@
               </w:rPr>
             </w:pPr>
             <w:proofErr w:type="spellStart"/>
-            <w:proofErr w:type="gramStart"/>
             <w:r>
               <w:rPr>
                 <w:rFonts w:ascii="Roboto Mono" w:hAnsi="Roboto Mono"/>
@@ -8407,14 +8313,7 @@
               <w:rPr>
                 <w:rFonts w:ascii="Roboto Mono" w:hAnsi="Roboto Mono"/>
               </w:rPr>
-              <w:t>(</w:t>
-            </w:r>
-            <w:proofErr w:type="gramEnd"/>
-            <w:r>
-              <w:rPr>
-                <w:rFonts w:ascii="Roboto Mono" w:hAnsi="Roboto Mono"/>
-              </w:rPr>
-              <w:t>)</w:t>
+              <w:t>()</w:t>
             </w:r>
           </w:p>
         </w:tc>
@@ -8455,19 +8354,11 @@
                 <w:rFonts w:ascii="Roboto Mono" w:hAnsi="Roboto Mono"/>
               </w:rPr>
             </w:pPr>
-            <w:proofErr w:type="gramStart"/>
             <w:r>
               <w:rPr>
                 <w:rFonts w:ascii="Roboto Mono" w:hAnsi="Roboto Mono"/>
               </w:rPr>
-              <w:t>arc(</w:t>
-            </w:r>
-            <w:proofErr w:type="gramEnd"/>
-            <w:r>
-              <w:rPr>
-                <w:rFonts w:ascii="Roboto Mono" w:hAnsi="Roboto Mono"/>
-              </w:rPr>
-              <w:t>)</w:t>
+              <w:t>arc()</w:t>
             </w:r>
           </w:p>
         </w:tc>
@@ -8509,7 +8400,6 @@
               </w:rPr>
             </w:pPr>
             <w:proofErr w:type="spellStart"/>
-            <w:proofErr w:type="gramStart"/>
             <w:r>
               <w:rPr>
                 <w:rFonts w:ascii="Roboto Mono" w:hAnsi="Roboto Mono"/>
@@ -8521,14 +8411,7 @@
               <w:rPr>
                 <w:rFonts w:ascii="Roboto Mono" w:hAnsi="Roboto Mono"/>
               </w:rPr>
-              <w:t>(</w:t>
-            </w:r>
-            <w:proofErr w:type="gramEnd"/>
-            <w:r>
-              <w:rPr>
-                <w:rFonts w:ascii="Roboto Mono" w:hAnsi="Roboto Mono"/>
-              </w:rPr>
-              <w:t>)</w:t>
+              <w:t>()</w:t>
             </w:r>
           </w:p>
         </w:tc>
@@ -8570,7 +8453,6 @@
               </w:rPr>
             </w:pPr>
             <w:proofErr w:type="spellStart"/>
-            <w:proofErr w:type="gramStart"/>
             <w:r>
               <w:rPr>
                 <w:rFonts w:ascii="Roboto Mono" w:hAnsi="Roboto Mono"/>
@@ -8582,14 +8464,7 @@
               <w:rPr>
                 <w:rFonts w:ascii="Roboto Mono" w:hAnsi="Roboto Mono"/>
               </w:rPr>
-              <w:t>(</w:t>
-            </w:r>
-            <w:proofErr w:type="gramEnd"/>
-            <w:r>
-              <w:rPr>
-                <w:rFonts w:ascii="Roboto Mono" w:hAnsi="Roboto Mono"/>
-              </w:rPr>
-              <w:t>)</w:t>
+              <w:t>()</w:t>
             </w:r>
           </w:p>
         </w:tc>
@@ -8631,7 +8506,6 @@
               </w:rPr>
             </w:pPr>
             <w:proofErr w:type="spellStart"/>
-            <w:proofErr w:type="gramStart"/>
             <w:r>
               <w:rPr>
                 <w:rFonts w:ascii="Roboto Mono" w:hAnsi="Roboto Mono"/>
@@ -8643,14 +8517,7 @@
               <w:rPr>
                 <w:rFonts w:ascii="Roboto Mono" w:hAnsi="Roboto Mono"/>
               </w:rPr>
-              <w:t>(</w:t>
-            </w:r>
-            <w:proofErr w:type="gramEnd"/>
-            <w:r>
-              <w:rPr>
-                <w:rFonts w:ascii="Roboto Mono" w:hAnsi="Roboto Mono"/>
-              </w:rPr>
-              <w:t>)</w:t>
+              <w:t>()</w:t>
             </w:r>
           </w:p>
         </w:tc>
@@ -8692,7 +8559,6 @@
               </w:rPr>
             </w:pPr>
             <w:proofErr w:type="spellStart"/>
-            <w:proofErr w:type="gramStart"/>
             <w:r>
               <w:rPr>
                 <w:rFonts w:ascii="Roboto Mono" w:hAnsi="Roboto Mono"/>
@@ -8704,14 +8570,7 @@
               <w:rPr>
                 <w:rFonts w:ascii="Roboto Mono" w:hAnsi="Roboto Mono"/>
               </w:rPr>
-              <w:t>(</w:t>
-            </w:r>
-            <w:proofErr w:type="gramEnd"/>
-            <w:r>
-              <w:rPr>
-                <w:rFonts w:ascii="Roboto Mono" w:hAnsi="Roboto Mono"/>
-              </w:rPr>
-              <w:t>)</w:t>
+              <w:t>()</w:t>
             </w:r>
           </w:p>
         </w:tc>
@@ -8753,7 +8612,6 @@
               </w:rPr>
             </w:pPr>
             <w:proofErr w:type="spellStart"/>
-            <w:proofErr w:type="gramStart"/>
             <w:r>
               <w:rPr>
                 <w:rFonts w:ascii="Roboto Mono" w:hAnsi="Roboto Mono"/>
@@ -8765,14 +8623,7 @@
               <w:rPr>
                 <w:rFonts w:ascii="Roboto Mono" w:hAnsi="Roboto Mono"/>
               </w:rPr>
-              <w:t>(</w:t>
-            </w:r>
-            <w:proofErr w:type="gramEnd"/>
-            <w:r>
-              <w:rPr>
-                <w:rFonts w:ascii="Roboto Mono" w:hAnsi="Roboto Mono"/>
-              </w:rPr>
-              <w:t>)</w:t>
+              <w:t>()</w:t>
             </w:r>
           </w:p>
         </w:tc>
@@ -8809,7 +8660,7 @@
           <w:rFonts w:ascii="Roboto Mono" w:hAnsi="Roboto Mono"/>
         </w:rPr>
         <w:pict w14:anchorId="3704FEC1">
-          <v:rect id="_x0000_i1191" style="width:0;height:1.5pt" o:hralign="center" o:hrstd="t" o:hr="t" fillcolor="#a0a0a0" stroked="f"/>
+          <v:rect id="_x0000_i1044" style="width:0;height:1.5pt" o:hralign="center" o:hrstd="t" o:hr="t" fillcolor="#a0a0a0" stroked="f"/>
         </w:pict>
       </w:r>
     </w:p>
@@ -9127,7 +8978,6 @@
         <w:t xml:space="preserve">let c = </w:t>
       </w:r>
       <w:proofErr w:type="spellStart"/>
-      <w:proofErr w:type="gramStart"/>
       <w:r>
         <w:rPr>
           <w:rFonts w:ascii="Roboto Mono" w:hAnsi="Roboto Mono"/>
@@ -9135,7 +8985,6 @@
         <w:t>document.getElementById</w:t>
       </w:r>
       <w:proofErr w:type="spellEnd"/>
-      <w:proofErr w:type="gramEnd"/>
       <w:r>
         <w:rPr>
           <w:rFonts w:ascii="Roboto Mono" w:hAnsi="Roboto Mono"/>
@@ -9178,7 +9027,6 @@
         <w:t xml:space="preserve"> = </w:t>
       </w:r>
       <w:proofErr w:type="spellStart"/>
-      <w:proofErr w:type="gramStart"/>
       <w:r>
         <w:rPr>
           <w:rFonts w:ascii="Roboto Mono" w:hAnsi="Roboto Mono"/>
@@ -9186,7 +9034,6 @@
         <w:t>c.getContext</w:t>
       </w:r>
       <w:proofErr w:type="spellEnd"/>
-      <w:proofErr w:type="gramEnd"/>
       <w:r>
         <w:rPr>
           <w:rFonts w:ascii="Roboto Mono" w:hAnsi="Roboto Mono"/>
@@ -9206,7 +9053,6 @@
         <w:br/>
       </w:r>
       <w:proofErr w:type="spellStart"/>
-      <w:proofErr w:type="gramStart"/>
       <w:r>
         <w:rPr>
           <w:rFonts w:ascii="Roboto Mono" w:hAnsi="Roboto Mono"/>
@@ -9214,7 +9060,6 @@
         <w:t>ctx.moveTo</w:t>
       </w:r>
       <w:proofErr w:type="spellEnd"/>
-      <w:proofErr w:type="gramEnd"/>
       <w:r>
         <w:rPr>
           <w:rFonts w:ascii="Roboto Mono" w:hAnsi="Roboto Mono"/>
@@ -9228,7 +9073,6 @@
         <w:br/>
       </w:r>
       <w:proofErr w:type="spellStart"/>
-      <w:proofErr w:type="gramStart"/>
       <w:r>
         <w:rPr>
           <w:rFonts w:ascii="Roboto Mono" w:hAnsi="Roboto Mono"/>
@@ -9236,7 +9080,6 @@
         <w:t>ctx.lineTo</w:t>
       </w:r>
       <w:proofErr w:type="spellEnd"/>
-      <w:proofErr w:type="gramEnd"/>
       <w:r>
         <w:rPr>
           <w:rFonts w:ascii="Roboto Mono" w:hAnsi="Roboto Mono"/>
@@ -9256,7 +9099,6 @@
         <w:br/>
       </w:r>
       <w:proofErr w:type="spellStart"/>
-      <w:proofErr w:type="gramStart"/>
       <w:r>
         <w:rPr>
           <w:rFonts w:ascii="Roboto Mono" w:hAnsi="Roboto Mono"/>
@@ -9264,7 +9106,6 @@
         <w:t>ctx.stroke</w:t>
       </w:r>
       <w:proofErr w:type="spellEnd"/>
-      <w:proofErr w:type="gramEnd"/>
       <w:r>
         <w:rPr>
           <w:rFonts w:ascii="Roboto Mono" w:hAnsi="Roboto Mono"/>
@@ -9296,7 +9137,7 @@
           <w:rFonts w:ascii="Roboto Mono" w:hAnsi="Roboto Mono"/>
         </w:rPr>
         <w:pict w14:anchorId="0E476142">
-          <v:rect id="_x0000_i1193" style="width:0;height:1.5pt" o:hralign="center" o:hrstd="t" o:hr="t" fillcolor="#a0a0a0" stroked="f"/>
+          <v:rect id="_x0000_i1045" style="width:0;height:1.5pt" o:hralign="center" o:hrstd="t" o:hr="t" fillcolor="#a0a0a0" stroked="f"/>
         </w:pict>
       </w:r>
     </w:p>
@@ -9450,21 +9291,7 @@
         <w:rPr>
           <w:rFonts w:ascii="Roboto Mono" w:hAnsi="Roboto Mono"/>
         </w:rPr>
-        <w:t xml:space="preserve">Draws a circle using </w:t>
-      </w:r>
-      <w:proofErr w:type="gramStart"/>
-      <w:r>
-        <w:rPr>
-          <w:rFonts w:ascii="Roboto Mono" w:hAnsi="Roboto Mono"/>
-        </w:rPr>
-        <w:t>arc(</w:t>
-      </w:r>
-      <w:proofErr w:type="gramEnd"/>
-      <w:r>
-        <w:rPr>
-          <w:rFonts w:ascii="Roboto Mono" w:hAnsi="Roboto Mono"/>
-        </w:rPr>
-        <w:t>).</w:t>
+        <w:t>Draws a circle using arc().</w:t>
       </w:r>
     </w:p>
     <w:p>
@@ -9628,7 +9455,6 @@
         <w:t xml:space="preserve">let c = </w:t>
       </w:r>
       <w:proofErr w:type="spellStart"/>
-      <w:proofErr w:type="gramStart"/>
       <w:r>
         <w:rPr>
           <w:rFonts w:ascii="Roboto Mono" w:hAnsi="Roboto Mono"/>
@@ -9636,7 +9462,6 @@
         <w:t>document.getElementById</w:t>
       </w:r>
       <w:proofErr w:type="spellEnd"/>
-      <w:proofErr w:type="gramEnd"/>
       <w:r>
         <w:rPr>
           <w:rFonts w:ascii="Roboto Mono" w:hAnsi="Roboto Mono"/>
@@ -9679,7 +9504,6 @@
         <w:t xml:space="preserve"> = </w:t>
       </w:r>
       <w:proofErr w:type="spellStart"/>
-      <w:proofErr w:type="gramStart"/>
       <w:r>
         <w:rPr>
           <w:rFonts w:ascii="Roboto Mono" w:hAnsi="Roboto Mono"/>
@@ -9687,7 +9511,6 @@
         <w:t>c.getContext</w:t>
       </w:r>
       <w:proofErr w:type="spellEnd"/>
-      <w:proofErr w:type="gramEnd"/>
       <w:r>
         <w:rPr>
           <w:rFonts w:ascii="Roboto Mono" w:hAnsi="Roboto Mono"/>
@@ -9707,7 +9530,6 @@
         <w:br/>
       </w:r>
       <w:proofErr w:type="spellStart"/>
-      <w:proofErr w:type="gramStart"/>
       <w:r>
         <w:rPr>
           <w:rFonts w:ascii="Roboto Mono" w:hAnsi="Roboto Mono"/>
@@ -9715,7 +9537,6 @@
         <w:t>ctx.beginPath</w:t>
       </w:r>
       <w:proofErr w:type="spellEnd"/>
-      <w:proofErr w:type="gramEnd"/>
       <w:r>
         <w:rPr>
           <w:rFonts w:ascii="Roboto Mono" w:hAnsi="Roboto Mono"/>
@@ -9733,20 +9554,7 @@
           <w:rFonts w:ascii="Roboto Mono" w:hAnsi="Roboto Mono"/>
         </w:rPr>
         <w:br/>
-      </w:r>
-      <w:proofErr w:type="gramStart"/>
-      <w:r>
-        <w:rPr>
-          <w:rFonts w:ascii="Roboto Mono" w:hAnsi="Roboto Mono"/>
-        </w:rPr>
-        <w:t>ctx.arc(</w:t>
-      </w:r>
-      <w:proofErr w:type="gramEnd"/>
-      <w:r>
-        <w:rPr>
-          <w:rFonts w:ascii="Roboto Mono" w:hAnsi="Roboto Mono"/>
-        </w:rPr>
-        <w:t xml:space="preserve">100, 100, 50, 0, 2 * </w:t>
+        <w:t xml:space="preserve">ctx.arc(100, 100, 50, 0, 2 * </w:t>
       </w:r>
       <w:proofErr w:type="spellStart"/>
       <w:r>
@@ -9775,7 +9583,6 @@
         <w:br/>
       </w:r>
       <w:proofErr w:type="spellStart"/>
-      <w:proofErr w:type="gramStart"/>
       <w:r>
         <w:rPr>
           <w:rFonts w:ascii="Roboto Mono" w:hAnsi="Roboto Mono"/>
@@ -9784,7 +9591,6 @@
         <w:t>ctx.stroke</w:t>
       </w:r>
       <w:proofErr w:type="spellEnd"/>
-      <w:proofErr w:type="gramEnd"/>
       <w:r>
         <w:rPr>
           <w:rFonts w:ascii="Roboto Mono" w:hAnsi="Roboto Mono"/>
@@ -9816,7 +9622,7 @@
           <w:rFonts w:ascii="Roboto Mono" w:hAnsi="Roboto Mono"/>
         </w:rPr>
         <w:pict w14:anchorId="1764B549">
-          <v:rect id="_x0000_i1195" style="width:0;height:1.5pt" o:hralign="center" o:hrstd="t" o:hr="t" fillcolor="#a0a0a0" stroked="f"/>
+          <v:rect id="_x0000_i1046" style="width:0;height:1.5pt" o:hralign="center" o:hrstd="t" o:hr="t" fillcolor="#a0a0a0" stroked="f"/>
         </w:pict>
       </w:r>
     </w:p>
@@ -10133,7 +9939,6 @@
         <w:t xml:space="preserve">let c = </w:t>
       </w:r>
       <w:proofErr w:type="spellStart"/>
-      <w:proofErr w:type="gramStart"/>
       <w:r>
         <w:rPr>
           <w:rFonts w:ascii="Roboto Mono" w:hAnsi="Roboto Mono"/>
@@ -10141,7 +9946,6 @@
         <w:t>document.getElementById</w:t>
       </w:r>
       <w:proofErr w:type="spellEnd"/>
-      <w:proofErr w:type="gramEnd"/>
       <w:r>
         <w:rPr>
           <w:rFonts w:ascii="Roboto Mono" w:hAnsi="Roboto Mono"/>
@@ -10184,7 +9988,6 @@
         <w:t xml:space="preserve"> = </w:t>
       </w:r>
       <w:proofErr w:type="spellStart"/>
-      <w:proofErr w:type="gramStart"/>
       <w:r>
         <w:rPr>
           <w:rFonts w:ascii="Roboto Mono" w:hAnsi="Roboto Mono"/>
@@ -10192,7 +9995,6 @@
         <w:t>c.getContext</w:t>
       </w:r>
       <w:proofErr w:type="spellEnd"/>
-      <w:proofErr w:type="gramEnd"/>
       <w:r>
         <w:rPr>
           <w:rFonts w:ascii="Roboto Mono" w:hAnsi="Roboto Mono"/>
@@ -10239,7 +10041,6 @@
         <w:br/>
       </w:r>
       <w:proofErr w:type="spellStart"/>
-      <w:proofErr w:type="gramStart"/>
       <w:r>
         <w:rPr>
           <w:rFonts w:ascii="Roboto Mono" w:hAnsi="Roboto Mono"/>
@@ -10247,7 +10048,6 @@
         <w:t>ctx.fillText</w:t>
       </w:r>
       <w:proofErr w:type="spellEnd"/>
-      <w:proofErr w:type="gramEnd"/>
       <w:r>
         <w:rPr>
           <w:rFonts w:ascii="Roboto Mono" w:hAnsi="Roboto Mono"/>
@@ -10279,7 +10079,7 @@
           <w:rFonts w:ascii="Roboto Mono" w:hAnsi="Roboto Mono"/>
         </w:rPr>
         <w:pict w14:anchorId="3971A801">
-          <v:rect id="_x0000_i1197" style="width:0;height:1.5pt" o:hralign="center" o:hrstd="t" o:hr="t" fillcolor="#a0a0a0" stroked="f"/>
+          <v:rect id="_x0000_i1047" style="width:0;height:1.5pt" o:hralign="center" o:hrstd="t" o:hr="t" fillcolor="#a0a0a0" stroked="f"/>
         </w:pict>
       </w:r>
     </w:p>
@@ -10596,7 +10396,6 @@
         <w:t xml:space="preserve">let c = </w:t>
       </w:r>
       <w:proofErr w:type="spellStart"/>
-      <w:proofErr w:type="gramStart"/>
       <w:r>
         <w:rPr>
           <w:rFonts w:ascii="Roboto Mono" w:hAnsi="Roboto Mono"/>
@@ -10604,7 +10403,6 @@
         <w:t>document.getElementById</w:t>
       </w:r>
       <w:proofErr w:type="spellEnd"/>
-      <w:proofErr w:type="gramEnd"/>
       <w:r>
         <w:rPr>
           <w:rFonts w:ascii="Roboto Mono" w:hAnsi="Roboto Mono"/>
@@ -10653,7 +10451,6 @@
         <w:t xml:space="preserve"> = </w:t>
       </w:r>
       <w:proofErr w:type="spellStart"/>
-      <w:proofErr w:type="gramStart"/>
       <w:r>
         <w:rPr>
           <w:rFonts w:ascii="Roboto Mono" w:hAnsi="Roboto Mono"/>
@@ -10661,7 +10458,6 @@
         <w:t>c.getContext</w:t>
       </w:r>
       <w:proofErr w:type="spellEnd"/>
-      <w:proofErr w:type="gramEnd"/>
       <w:r>
         <w:rPr>
           <w:rFonts w:ascii="Roboto Mono" w:hAnsi="Roboto Mono"/>
@@ -10707,7 +10503,6 @@
         <w:br/>
       </w:r>
       <w:proofErr w:type="spellStart"/>
-      <w:proofErr w:type="gramStart"/>
       <w:r>
         <w:rPr>
           <w:rFonts w:ascii="Roboto Mono" w:hAnsi="Roboto Mono"/>
@@ -10715,7 +10510,6 @@
         <w:t>ctx.strokeText</w:t>
       </w:r>
       <w:proofErr w:type="spellEnd"/>
-      <w:proofErr w:type="gramEnd"/>
       <w:r>
         <w:rPr>
           <w:rFonts w:ascii="Roboto Mono" w:hAnsi="Roboto Mono"/>
@@ -10747,7 +10541,7 @@
           <w:rFonts w:ascii="Roboto Mono" w:hAnsi="Roboto Mono"/>
         </w:rPr>
         <w:pict w14:anchorId="38C79C6A">
-          <v:rect id="_x0000_i1199" style="width:0;height:1.5pt" o:hralign="center" o:hrstd="t" o:hr="t" fillcolor="#a0a0a0" stroked="f"/>
+          <v:rect id="_x0000_i1048" style="width:0;height:1.5pt" o:hralign="center" o:hrstd="t" o:hr="t" fillcolor="#a0a0a0" stroked="f"/>
         </w:pict>
       </w:r>
     </w:p>
@@ -11310,7 +11104,7 @@
           <w:rFonts w:ascii="Roboto Mono" w:hAnsi="Roboto Mono"/>
         </w:rPr>
         <w:pict w14:anchorId="109CC165">
-          <v:rect id="_x0000_i1201" style="width:0;height:1.5pt" o:hralign="center" o:hrstd="t" o:hr="t" fillcolor="#a0a0a0" stroked="f"/>
+          <v:rect id="_x0000_i1049" style="width:0;height:1.5pt" o:hralign="center" o:hrstd="t" o:hr="t" fillcolor="#a0a0a0" stroked="f"/>
         </w:pict>
       </w:r>
     </w:p>
@@ -11952,7 +11746,7 @@
           <w:rFonts w:ascii="Roboto Mono" w:hAnsi="Roboto Mono"/>
         </w:rPr>
         <w:pict w14:anchorId="59A73440">
-          <v:rect id="_x0000_i1203" style="width:0;height:1.5pt" o:hralign="center" o:hrstd="t" o:hr="t" fillcolor="#a0a0a0" stroked="f"/>
+          <v:rect id="_x0000_i1050" style="width:0;height:1.5pt" o:hralign="center" o:hrstd="t" o:hr="t" fillcolor="#a0a0a0" stroked="f"/>
         </w:pict>
       </w:r>
     </w:p>
@@ -12325,7 +12119,6 @@
         <w:t xml:space="preserve">let c = </w:t>
       </w:r>
       <w:proofErr w:type="spellStart"/>
-      <w:proofErr w:type="gramStart"/>
       <w:r>
         <w:rPr>
           <w:rFonts w:ascii="Roboto Mono" w:hAnsi="Roboto Mono"/>
@@ -12333,7 +12126,6 @@
         <w:t>document.getElementById</w:t>
       </w:r>
       <w:proofErr w:type="spellEnd"/>
-      <w:proofErr w:type="gramEnd"/>
       <w:r>
         <w:rPr>
           <w:rFonts w:ascii="Roboto Mono" w:hAnsi="Roboto Mono"/>
@@ -12376,7 +12168,6 @@
         <w:t xml:space="preserve"> = </w:t>
       </w:r>
       <w:proofErr w:type="spellStart"/>
-      <w:proofErr w:type="gramStart"/>
       <w:r>
         <w:rPr>
           <w:rFonts w:ascii="Roboto Mono" w:hAnsi="Roboto Mono"/>
@@ -12384,7 +12175,6 @@
         <w:t>c.getContext</w:t>
       </w:r>
       <w:proofErr w:type="spellEnd"/>
-      <w:proofErr w:type="gramEnd"/>
       <w:r>
         <w:rPr>
           <w:rFonts w:ascii="Roboto Mono" w:hAnsi="Roboto Mono"/>
@@ -12419,7 +12209,6 @@
         <w:t xml:space="preserve"> = </w:t>
       </w:r>
       <w:proofErr w:type="spellStart"/>
-      <w:proofErr w:type="gramStart"/>
       <w:r>
         <w:rPr>
           <w:rFonts w:ascii="Roboto Mono" w:hAnsi="Roboto Mono"/>
@@ -12427,7 +12216,6 @@
         <w:t>document.getElementById</w:t>
       </w:r>
       <w:proofErr w:type="spellEnd"/>
-      <w:proofErr w:type="gramEnd"/>
       <w:r>
         <w:rPr>
           <w:rFonts w:ascii="Roboto Mono" w:hAnsi="Roboto Mono"/>
@@ -12447,7 +12235,6 @@
         <w:br/>
       </w:r>
       <w:proofErr w:type="spellStart"/>
-      <w:proofErr w:type="gramStart"/>
       <w:r>
         <w:rPr>
           <w:rFonts w:ascii="Roboto Mono" w:hAnsi="Roboto Mono"/>
@@ -12455,7 +12242,6 @@
         <w:t>ctx.drawImage</w:t>
       </w:r>
       <w:proofErr w:type="spellEnd"/>
-      <w:proofErr w:type="gramEnd"/>
       <w:r>
         <w:rPr>
           <w:rFonts w:ascii="Roboto Mono" w:hAnsi="Roboto Mono"/>
@@ -12501,7 +12287,7 @@
           <w:rFonts w:ascii="Roboto Mono" w:hAnsi="Roboto Mono"/>
         </w:rPr>
         <w:pict w14:anchorId="6A2773D3">
-          <v:rect id="_x0000_i1205" style="width:0;height:1.5pt" o:hralign="center" o:hrstd="t" o:hr="t" fillcolor="#a0a0a0" stroked="f"/>
+          <v:rect id="_x0000_i1051" style="width:0;height:1.5pt" o:hralign="center" o:hrstd="t" o:hr="t" fillcolor="#a0a0a0" stroked="f"/>
         </w:pict>
       </w:r>
     </w:p>
@@ -13984,7 +13770,7 @@
           <w:noProof/>
         </w:rPr>
         <w:drawing>
-          <wp:inline distT="0" distB="0" distL="0" distR="0" wp14:anchorId="0238EF9C" wp14:editId="2DF65537">
+          <wp:inline distT="0" distB="0" distL="0" distR="0" wp14:anchorId="0238EF9C" wp14:editId="4939543C">
             <wp:extent cx="5943600" cy="3178175"/>
             <wp:effectExtent l="0" t="0" r="0" b="3175"/>
             <wp:docPr id="540194930" name="Picture 21"/>
@@ -14044,7 +13830,7 @@
           <w:rFonts w:ascii="Roboto Mono" w:hAnsi="Roboto Mono"/>
         </w:rPr>
         <w:pict w14:anchorId="06935A78">
-          <v:rect id="_x0000_i1206" style="width:0;height:1.5pt" o:hralign="center" o:hrstd="t" o:hr="t" fillcolor="#a0a0a0" stroked="f"/>
+          <v:rect id="_x0000_i1052" style="width:0;height:1.5pt" o:hralign="center" o:hrstd="t" o:hr="t" fillcolor="#a0a0a0" stroked="f"/>
         </w:pict>
       </w:r>
     </w:p>
@@ -14168,6 +13954,7 @@
       <w:r>
         <w:rPr>
           <w:rFonts w:ascii="Roboto Mono" w:hAnsi="Roboto Mono"/>
+          <w:noProof/>
         </w:rPr>
         <w:lastRenderedPageBreak/>
         <w:drawing>
@@ -14229,6 +14016,7 @@
       <w:r>
         <w:rPr>
           <w:rFonts w:ascii="Roboto Mono" w:hAnsi="Roboto Mono"/>
+          <w:noProof/>
         </w:rPr>
         <w:drawing>
           <wp:inline distT="0" distB="0" distL="0" distR="0" wp14:anchorId="1D585572" wp14:editId="1C1F1CC3">
@@ -14289,6 +14077,7 @@
       <w:r>
         <w:rPr>
           <w:rFonts w:ascii="Roboto Mono" w:hAnsi="Roboto Mono"/>
+          <w:noProof/>
         </w:rPr>
         <w:lastRenderedPageBreak/>
         <w:drawing>
@@ -14489,7 +14278,6 @@
               </w:rPr>
             </w:pPr>
             <w:proofErr w:type="spellStart"/>
-            <w:proofErr w:type="gramStart"/>
             <w:r>
               <w:rPr>
                 <w:rFonts w:ascii="Roboto Mono" w:hAnsi="Roboto Mono"/>
@@ -14501,14 +14289,7 @@
               <w:rPr>
                 <w:rFonts w:ascii="Roboto Mono" w:hAnsi="Roboto Mono"/>
               </w:rPr>
-              <w:t>(</w:t>
-            </w:r>
-            <w:proofErr w:type="gramEnd"/>
-            <w:r>
-              <w:rPr>
-                <w:rFonts w:ascii="Roboto Mono" w:hAnsi="Roboto Mono"/>
-              </w:rPr>
-              <w:t>)</w:t>
+              <w:t>()</w:t>
             </w:r>
           </w:p>
         </w:tc>
@@ -14549,19 +14330,11 @@
                 <w:rFonts w:ascii="Roboto Mono" w:hAnsi="Roboto Mono"/>
               </w:rPr>
             </w:pPr>
-            <w:proofErr w:type="gramStart"/>
             <w:r>
               <w:rPr>
                 <w:rFonts w:ascii="Roboto Mono" w:hAnsi="Roboto Mono"/>
               </w:rPr>
-              <w:t>arc(</w:t>
-            </w:r>
-            <w:proofErr w:type="gramEnd"/>
-            <w:r>
-              <w:rPr>
-                <w:rFonts w:ascii="Roboto Mono" w:hAnsi="Roboto Mono"/>
-              </w:rPr>
-              <w:t>)</w:t>
+              <w:t>arc()</w:t>
             </w:r>
           </w:p>
         </w:tc>
@@ -14603,7 +14376,6 @@
               </w:rPr>
             </w:pPr>
             <w:proofErr w:type="spellStart"/>
-            <w:proofErr w:type="gramStart"/>
             <w:r>
               <w:rPr>
                 <w:rFonts w:ascii="Roboto Mono" w:hAnsi="Roboto Mono"/>
@@ -14615,14 +14387,7 @@
               <w:rPr>
                 <w:rFonts w:ascii="Roboto Mono" w:hAnsi="Roboto Mono"/>
               </w:rPr>
-              <w:t>(</w:t>
-            </w:r>
-            <w:proofErr w:type="gramEnd"/>
-            <w:r>
-              <w:rPr>
-                <w:rFonts w:ascii="Roboto Mono" w:hAnsi="Roboto Mono"/>
-              </w:rPr>
-              <w:t>)</w:t>
+              <w:t>()</w:t>
             </w:r>
           </w:p>
         </w:tc>
@@ -14664,7 +14429,6 @@
               </w:rPr>
             </w:pPr>
             <w:proofErr w:type="spellStart"/>
-            <w:proofErr w:type="gramStart"/>
             <w:r>
               <w:rPr>
                 <w:rFonts w:ascii="Roboto Mono" w:hAnsi="Roboto Mono"/>
@@ -14676,14 +14440,7 @@
               <w:rPr>
                 <w:rFonts w:ascii="Roboto Mono" w:hAnsi="Roboto Mono"/>
               </w:rPr>
-              <w:t>(</w:t>
-            </w:r>
-            <w:proofErr w:type="gramEnd"/>
-            <w:r>
-              <w:rPr>
-                <w:rFonts w:ascii="Roboto Mono" w:hAnsi="Roboto Mono"/>
-              </w:rPr>
-              <w:t>)</w:t>
+              <w:t>()</w:t>
             </w:r>
           </w:p>
         </w:tc>
@@ -14725,7 +14482,6 @@
               </w:rPr>
             </w:pPr>
             <w:proofErr w:type="spellStart"/>
-            <w:proofErr w:type="gramStart"/>
             <w:r>
               <w:rPr>
                 <w:rFonts w:ascii="Roboto Mono" w:hAnsi="Roboto Mono"/>
@@ -14737,14 +14493,7 @@
               <w:rPr>
                 <w:rFonts w:ascii="Roboto Mono" w:hAnsi="Roboto Mono"/>
               </w:rPr>
-              <w:t>(</w:t>
-            </w:r>
-            <w:proofErr w:type="gramEnd"/>
-            <w:r>
-              <w:rPr>
-                <w:rFonts w:ascii="Roboto Mono" w:hAnsi="Roboto Mono"/>
-              </w:rPr>
-              <w:t>)</w:t>
+              <w:t>()</w:t>
             </w:r>
           </w:p>
         </w:tc>
@@ -14786,7 +14535,6 @@
               </w:rPr>
             </w:pPr>
             <w:proofErr w:type="spellStart"/>
-            <w:proofErr w:type="gramStart"/>
             <w:r>
               <w:rPr>
                 <w:rFonts w:ascii="Roboto Mono" w:hAnsi="Roboto Mono"/>
@@ -14798,14 +14546,7 @@
               <w:rPr>
                 <w:rFonts w:ascii="Roboto Mono" w:hAnsi="Roboto Mono"/>
               </w:rPr>
-              <w:t>(</w:t>
-            </w:r>
-            <w:proofErr w:type="gramEnd"/>
-            <w:r>
-              <w:rPr>
-                <w:rFonts w:ascii="Roboto Mono" w:hAnsi="Roboto Mono"/>
-              </w:rPr>
-              <w:t>)</w:t>
+              <w:t>()</w:t>
             </w:r>
           </w:p>
         </w:tc>
@@ -14847,7 +14588,6 @@
               </w:rPr>
             </w:pPr>
             <w:proofErr w:type="spellStart"/>
-            <w:proofErr w:type="gramStart"/>
             <w:r>
               <w:rPr>
                 <w:rFonts w:ascii="Roboto Mono" w:hAnsi="Roboto Mono"/>
@@ -14859,14 +14599,7 @@
               <w:rPr>
                 <w:rFonts w:ascii="Roboto Mono" w:hAnsi="Roboto Mono"/>
               </w:rPr>
-              <w:t>(</w:t>
-            </w:r>
-            <w:proofErr w:type="gramEnd"/>
-            <w:r>
-              <w:rPr>
-                <w:rFonts w:ascii="Roboto Mono" w:hAnsi="Roboto Mono"/>
-              </w:rPr>
-              <w:t>)</w:t>
+              <w:t>()</w:t>
             </w:r>
           </w:p>
         </w:tc>
@@ -14903,7 +14636,7 @@
           <w:rFonts w:ascii="Roboto Mono" w:hAnsi="Roboto Mono"/>
         </w:rPr>
         <w:pict w14:anchorId="0E05B368">
-          <v:rect id="_x0000_i1210" style="width:0;height:1.5pt" o:hralign="center" o:hrstd="t" o:hr="t" fillcolor="#a0a0a0" stroked="f"/>
+          <v:rect id="_x0000_i1053" style="width:0;height:1.5pt" o:hralign="center" o:hrstd="t" o:hr="t" fillcolor="#a0a0a0" stroked="f"/>
         </w:pict>
       </w:r>
     </w:p>
@@ -15062,7 +14795,7 @@
           <w:rFonts w:ascii="Roboto Mono" w:hAnsi="Roboto Mono"/>
         </w:rPr>
         <w:pict w14:anchorId="6D6ED327">
-          <v:rect id="_x0000_i1212" style="width:0;height:1.5pt" o:hralign="center" o:hrstd="t" o:hr="t" fillcolor="#a0a0a0" stroked="f"/>
+          <v:rect id="_x0000_i1054" style="width:0;height:1.5pt" o:hralign="center" o:hrstd="t" o:hr="t" fillcolor="#a0a0a0" stroked="f"/>
         </w:pict>
       </w:r>
     </w:p>
@@ -15080,17 +14813,12 @@
         <w:t xml:space="preserve"> Use </w:t>
       </w:r>
       <w:proofErr w:type="spellStart"/>
-      <w:proofErr w:type="gramStart"/>
       <w:r>
         <w:t>beginPath</w:t>
       </w:r>
       <w:proofErr w:type="spellEnd"/>
       <w:r>
-        <w:t>(</w:t>
-      </w:r>
-      <w:proofErr w:type="gramEnd"/>
-      <w:r>
-        <w:t>) for new shapes</w:t>
+        <w:t>() for new shapes</w:t>
       </w:r>
     </w:p>
     <w:p>
@@ -15220,7 +14948,7 @@
           <w:rFonts w:ascii="Roboto Mono" w:hAnsi="Roboto Mono"/>
         </w:rPr>
         <w:pict w14:anchorId="4FA7710F">
-          <v:rect id="_x0000_i1213" style="width:0;height:1.5pt" o:hralign="center" o:hrstd="t" o:hr="t" fillcolor="#a0a0a0" stroked="f"/>
+          <v:rect id="_x0000_i1055" style="width:0;height:1.5pt" o:hralign="center" o:hrstd="t" o:hr="t" fillcolor="#a0a0a0" stroked="f"/>
         </w:pict>
       </w:r>
     </w:p>
@@ -15365,7 +15093,7 @@
           <w:rFonts w:ascii="Roboto Mono" w:hAnsi="Roboto Mono"/>
         </w:rPr>
         <w:pict w14:anchorId="65A929E2">
-          <v:rect id="_x0000_i1214" style="width:0;height:1.5pt" o:hralign="center" o:hrstd="t" o:hr="t" fillcolor="#a0a0a0" stroked="f"/>
+          <v:rect id="_x0000_i1056" style="width:0;height:1.5pt" o:hralign="center" o:hrstd="t" o:hr="t" fillcolor="#a0a0a0" stroked="f"/>
         </w:pict>
       </w:r>
     </w:p>
@@ -15511,7 +15239,7 @@
           <w:rFonts w:ascii="Roboto Mono" w:hAnsi="Roboto Mono"/>
         </w:rPr>
         <w:pict w14:anchorId="25B8B059">
-          <v:rect id="_x0000_i1215" style="width:0;height:1.5pt" o:hralign="center" o:hrstd="t" o:hr="t" fillcolor="#a0a0a0" stroked="f"/>
+          <v:rect id="_x0000_i1057" style="width:0;height:1.5pt" o:hralign="center" o:hrstd="t" o:hr="t" fillcolor="#a0a0a0" stroked="f"/>
         </w:pict>
       </w:r>
     </w:p>
@@ -15885,7 +15613,7 @@
           <w:rFonts w:ascii="Roboto Mono" w:hAnsi="Roboto Mono"/>
         </w:rPr>
         <w:pict w14:anchorId="39822874">
-          <v:rect id="_x0000_i1588" style="width:0;height:1.5pt" o:hralign="center" o:hrstd="t" o:hr="t" fillcolor="#a0a0a0" stroked="f"/>
+          <v:rect id="_x0000_i1058" style="width:0;height:1.5pt" o:hralign="center" o:hrstd="t" o:hr="t" fillcolor="#a0a0a0" stroked="f"/>
         </w:pict>
       </w:r>
     </w:p>
@@ -16502,7 +16230,7 @@
           <w:rFonts w:ascii="Roboto Mono" w:hAnsi="Roboto Mono"/>
         </w:rPr>
         <w:pict w14:anchorId="5156AC9A">
-          <v:rect id="_x0000_i1589" style="width:0;height:1.5pt" o:hralign="center" o:hrstd="t" o:hr="t" fillcolor="#a0a0a0" stroked="f"/>
+          <v:rect id="_x0000_i1059" style="width:0;height:1.5pt" o:hralign="center" o:hrstd="t" o:hr="t" fillcolor="#a0a0a0" stroked="f"/>
         </w:pict>
       </w:r>
     </w:p>
@@ -16901,7 +16629,7 @@
           <w:rFonts w:ascii="Roboto Mono" w:hAnsi="Roboto Mono"/>
         </w:rPr>
         <w:pict w14:anchorId="7CDA683C">
-          <v:rect id="_x0000_i1592" style="width:0;height:1.5pt" o:hralign="center" o:hrstd="t" o:hr="t" fillcolor="#a0a0a0" stroked="f"/>
+          <v:rect id="_x0000_i1060" style="width:0;height:1.5pt" o:hralign="center" o:hrstd="t" o:hr="t" fillcolor="#a0a0a0" stroked="f"/>
         </w:pict>
       </w:r>
     </w:p>
@@ -17315,7 +17043,7 @@
           <w:rFonts w:ascii="Roboto Mono" w:hAnsi="Roboto Mono"/>
         </w:rPr>
         <w:pict w14:anchorId="70A7CB6F">
-          <v:rect id="_x0000_i1595" style="width:0;height:1.5pt" o:hralign="center" o:hrstd="t" o:hr="t" fillcolor="#a0a0a0" stroked="f"/>
+          <v:rect id="_x0000_i1061" style="width:0;height:1.5pt" o:hralign="center" o:hrstd="t" o:hr="t" fillcolor="#a0a0a0" stroked="f"/>
         </w:pict>
       </w:r>
     </w:p>
@@ -17830,7 +17558,7 @@
           <w:rFonts w:ascii="Roboto Mono" w:hAnsi="Roboto Mono"/>
         </w:rPr>
         <w:pict w14:anchorId="07A4913A">
-          <v:rect id="_x0000_i1598" style="width:0;height:1.5pt" o:hralign="center" o:hrstd="t" o:hr="t" fillcolor="#a0a0a0" stroked="f"/>
+          <v:rect id="_x0000_i1062" style="width:0;height:1.5pt" o:hralign="center" o:hrstd="t" o:hr="t" fillcolor="#a0a0a0" stroked="f"/>
         </w:pict>
       </w:r>
     </w:p>
@@ -18334,7 +18062,7 @@
           <w:rFonts w:ascii="Roboto Mono" w:hAnsi="Roboto Mono"/>
         </w:rPr>
         <w:pict w14:anchorId="175ECA9E">
-          <v:rect id="_x0000_i1601" style="width:0;height:1.5pt" o:hralign="center" o:hrstd="t" o:hr="t" fillcolor="#a0a0a0" stroked="f"/>
+          <v:rect id="_x0000_i1063" style="width:0;height:1.5pt" o:hralign="center" o:hrstd="t" o:hr="t" fillcolor="#a0a0a0" stroked="f"/>
         </w:pict>
       </w:r>
     </w:p>
@@ -19223,7 +18951,7 @@
           <w:rFonts w:ascii="Roboto Mono" w:hAnsi="Roboto Mono"/>
         </w:rPr>
         <w:pict w14:anchorId="205DAFDB">
-          <v:rect id="_x0000_i1604" style="width:0;height:1.5pt" o:hralign="center" o:hrstd="t" o:hr="t" fillcolor="#a0a0a0" stroked="f"/>
+          <v:rect id="_x0000_i1064" style="width:0;height:1.5pt" o:hralign="center" o:hrstd="t" o:hr="t" fillcolor="#a0a0a0" stroked="f"/>
         </w:pict>
       </w:r>
     </w:p>
@@ -21345,21 +21073,7 @@
         <w:rPr>
           <w:rFonts w:ascii="Roboto Mono" w:hAnsi="Roboto Mono"/>
         </w:rPr>
-        <w:t xml:space="preserve">    </w:t>
-      </w:r>
-      <w:proofErr w:type="gramStart"/>
-      <w:r>
-        <w:rPr>
-          <w:rFonts w:ascii="Roboto Mono" w:hAnsi="Roboto Mono"/>
-        </w:rPr>
-        <w:t>&lt;!--</w:t>
-      </w:r>
-      <w:proofErr w:type="gramEnd"/>
-      <w:r>
-        <w:rPr>
-          <w:rFonts w:ascii="Roboto Mono" w:hAnsi="Roboto Mono"/>
-        </w:rPr>
-        <w:t xml:space="preserve"> Circle --&gt;</w:t>
+        <w:t xml:space="preserve">    &lt;!-- Circle --&gt;</w:t>
       </w:r>
     </w:p>
     <w:p>
@@ -21545,21 +21259,7 @@
         <w:rPr>
           <w:rFonts w:ascii="Roboto Mono" w:hAnsi="Roboto Mono"/>
         </w:rPr>
-        <w:t xml:space="preserve">    </w:t>
-      </w:r>
-      <w:proofErr w:type="gramStart"/>
-      <w:r>
-        <w:rPr>
-          <w:rFonts w:ascii="Roboto Mono" w:hAnsi="Roboto Mono"/>
-        </w:rPr>
-        <w:t>&lt;!--</w:t>
-      </w:r>
-      <w:proofErr w:type="gramEnd"/>
-      <w:r>
-        <w:rPr>
-          <w:rFonts w:ascii="Roboto Mono" w:hAnsi="Roboto Mono"/>
-        </w:rPr>
-        <w:t xml:space="preserve"> Rectangle --&gt;</w:t>
+        <w:t xml:space="preserve">    &lt;!-- Rectangle --&gt;</w:t>
       </w:r>
     </w:p>
     <w:p>
@@ -21761,21 +21461,7 @@
         <w:rPr>
           <w:rFonts w:ascii="Roboto Mono" w:hAnsi="Roboto Mono"/>
         </w:rPr>
-        <w:t xml:space="preserve">    </w:t>
-      </w:r>
-      <w:proofErr w:type="gramStart"/>
-      <w:r>
-        <w:rPr>
-          <w:rFonts w:ascii="Roboto Mono" w:hAnsi="Roboto Mono"/>
-        </w:rPr>
-        <w:t>&lt;!--</w:t>
-      </w:r>
-      <w:proofErr w:type="gramEnd"/>
-      <w:r>
-        <w:rPr>
-          <w:rFonts w:ascii="Roboto Mono" w:hAnsi="Roboto Mono"/>
-        </w:rPr>
-        <w:t xml:space="preserve"> Rounded Rectangle --&gt;</w:t>
+        <w:t xml:space="preserve">    &lt;!-- Rounded Rectangle --&gt;</w:t>
       </w:r>
     </w:p>
     <w:p>
@@ -22043,21 +21729,7 @@
         <w:rPr>
           <w:rFonts w:ascii="Roboto Mono" w:hAnsi="Roboto Mono"/>
         </w:rPr>
-        <w:t xml:space="preserve">    </w:t>
-      </w:r>
-      <w:proofErr w:type="gramStart"/>
-      <w:r>
-        <w:rPr>
-          <w:rFonts w:ascii="Roboto Mono" w:hAnsi="Roboto Mono"/>
-        </w:rPr>
-        <w:t>&lt;!--</w:t>
-      </w:r>
-      <w:proofErr w:type="gramEnd"/>
-      <w:r>
-        <w:rPr>
-          <w:rFonts w:ascii="Roboto Mono" w:hAnsi="Roboto Mono"/>
-        </w:rPr>
-        <w:t xml:space="preserve"> Star --&gt;</w:t>
+        <w:t xml:space="preserve">    &lt;!-- Star --&gt;</w:t>
       </w:r>
     </w:p>
     <w:p>
@@ -22347,21 +22019,7 @@
         <w:rPr>
           <w:rFonts w:ascii="Roboto Mono" w:hAnsi="Roboto Mono"/>
         </w:rPr>
-        <w:t xml:space="preserve">    </w:t>
-      </w:r>
-      <w:proofErr w:type="gramStart"/>
-      <w:r>
-        <w:rPr>
-          <w:rFonts w:ascii="Roboto Mono" w:hAnsi="Roboto Mono"/>
-        </w:rPr>
-        <w:t>&lt;!--</w:t>
-      </w:r>
-      <w:proofErr w:type="gramEnd"/>
-      <w:r>
-        <w:rPr>
-          <w:rFonts w:ascii="Roboto Mono" w:hAnsi="Roboto Mono"/>
-        </w:rPr>
-        <w:t xml:space="preserve"> Gradient Ellipse --&gt;</w:t>
+        <w:t xml:space="preserve">    &lt;!-- Gradient Ellipse --&gt;</w:t>
       </w:r>
     </w:p>
     <w:p>
@@ -22961,8 +22619,164 @@
       </w:pPr>
       <w:r>
         <w:rPr>
+          <w:rFonts w:ascii="Arial" w:hAnsi="Arial"/>
+          <w:b/>
+          <w:sz w:val="18"/>
+          <w:highlight w:val="lightGray"/>
+        </w:rPr>
+        <w:t># Source: GIF</w:t>
+      </w:r>
+      <w:r>
+        <w:rPr>
+          <w:rFonts w:ascii="Arial" w:hAnsi="Arial"/>
+          <w:sz w:val="18"/>
+          <w:highlight w:val="lightGray"/>
+        </w:rPr>
+        <w:t xml:space="preserve"> </w:t>
+      </w:r>
+      <w:r>
+        <w:rPr>
+          <w:rFonts w:ascii="Arial" w:hAnsi="Arial"/>
+          <w:b/>
+          <w:sz w:val="18"/>
+          <w:highlight w:val="lightGray"/>
+        </w:rPr>
+        <w:t>Source</w:t>
+      </w:r>
+      <w:r>
+        <w:rPr>
+          <w:rFonts w:ascii="Arial" w:hAnsi="Arial"/>
+          <w:sz w:val="18"/>
+          <w:highlight w:val="lightGray"/>
+        </w:rPr>
+        <w:t xml:space="preserve">: </w:t>
+      </w:r>
+      <w:r>
+        <w:rPr>
+          <w:rFonts w:ascii="Arial" w:hAnsi="Arial"/>
+          <w:b/>
+          <w:sz w:val="18"/>
+          <w:highlight w:val="lightGray"/>
+        </w:rPr>
+        <w:t>Provided by:</w:t>
+      </w:r>
+      <w:r>
+        <w:rPr>
+          <w:rFonts w:ascii="Arial" w:hAnsi="Arial"/>
+          <w:sz w:val="18"/>
+          <w:highlight w:val="lightGray"/>
+        </w:rPr>
+        <w:t xml:space="preserve"> [Persons Table -&gt; ID Column: 1, </w:t>
+      </w:r>
+      <w:proofErr w:type="spellStart"/>
+      <w:r>
+        <w:rPr>
+          <w:rFonts w:ascii="Arial" w:hAnsi="Arial"/>
+          <w:sz w:val="18"/>
+          <w:highlight w:val="lightGray"/>
+        </w:rPr>
+        <w:t>Name_En</w:t>
+      </w:r>
+      <w:proofErr w:type="spellEnd"/>
+      <w:r>
+        <w:rPr>
+          <w:rFonts w:ascii="Arial" w:hAnsi="Arial"/>
+          <w:sz w:val="18"/>
+          <w:highlight w:val="lightGray"/>
+        </w:rPr>
+        <w:t xml:space="preserve"> Column: Motasem Essam] -&gt; </w:t>
+      </w:r>
+      <w:r>
+        <w:rPr>
+          <w:rFonts w:ascii="Arial" w:hAnsi="Arial"/>
+          <w:b/>
+          <w:sz w:val="18"/>
+          <w:highlight w:val="lightGray"/>
+        </w:rPr>
+        <w:t>Tool:</w:t>
+      </w:r>
+      <w:r>
+        <w:rPr>
+          <w:rFonts w:ascii="Arial" w:hAnsi="Arial"/>
+          <w:sz w:val="18"/>
+          <w:highlight w:val="lightGray"/>
+        </w:rPr>
+        <w:t xml:space="preserve"> [Automation Table -&gt; ID Column: 17, </w:t>
+      </w:r>
+      <w:proofErr w:type="spellStart"/>
+      <w:r>
+        <w:rPr>
+          <w:rFonts w:ascii="Arial" w:hAnsi="Arial"/>
+          <w:sz w:val="18"/>
+          <w:highlight w:val="lightGray"/>
+        </w:rPr>
+        <w:t>Name_En</w:t>
+      </w:r>
+      <w:proofErr w:type="spellEnd"/>
+      <w:r>
+        <w:rPr>
+          <w:rFonts w:ascii="Arial" w:hAnsi="Arial"/>
+          <w:sz w:val="18"/>
+          <w:highlight w:val="lightGray"/>
+        </w:rPr>
+        <w:t xml:space="preserve"> Column: GIF Recorder] -&gt; </w:t>
+      </w:r>
+      <w:r>
+        <w:rPr>
+          <w:rFonts w:ascii="Arial" w:eastAsia="Arial" w:hAnsi="Arial" w:cs="Arial"/>
+          <w:b/>
+          <w:color w:val="000000"/>
+          <w:sz w:val="18"/>
+          <w:highlight w:val="lightGray"/>
+        </w:rPr>
+        <w:t xml:space="preserve">From </w:t>
+      </w:r>
+      <w:r>
+        <w:rPr>
+          <w:rFonts w:ascii="Arial" w:eastAsia="Arial" w:hAnsi="Arial" w:cs="Arial"/>
+          <w:color w:val="000000"/>
+          <w:sz w:val="18"/>
+          <w:highlight w:val="lightGray"/>
+        </w:rPr>
+        <w:t>[Operating System: Windows]</w:t>
+      </w:r>
+      <w:r>
+        <w:rPr>
+          <w:rFonts w:ascii="Arial" w:hAnsi="Arial"/>
+          <w:sz w:val="18"/>
+          <w:highlight w:val="lightGray"/>
+        </w:rPr>
+        <w:t xml:space="preserve"> </w:t>
+      </w:r>
+      <w:r>
+        <w:rPr>
+          <w:rFonts w:ascii="Arial" w:hAnsi="Arial"/>
+          <w:b/>
+          <w:sz w:val="18"/>
+          <w:highlight w:val="lightGray"/>
+        </w:rPr>
+        <w:t>on</w:t>
+      </w:r>
+      <w:r>
+        <w:rPr>
+          <w:rFonts w:ascii="Arial" w:hAnsi="Arial"/>
+          <w:sz w:val="18"/>
+          <w:highlight w:val="lightGray"/>
+        </w:rPr>
+        <w:t xml:space="preserve"> [5/6/2026]</w:t>
+      </w:r>
+    </w:p>
+    <w:p>
+      <w:pPr>
+        <w:rPr>
+          <w:rFonts w:ascii="Roboto Mono" w:hAnsi="Roboto Mono"/>
+        </w:rPr>
+      </w:pPr>
+      <w:r>
+        <w:rPr>
           <w:noProof/>
         </w:rPr>
+        <w:lastRenderedPageBreak/>
         <w:drawing>
           <wp:inline distT="0" distB="0" distL="0" distR="0" wp14:anchorId="7C3EB394" wp14:editId="520E746C">
             <wp:extent cx="5943600" cy="3343275"/>
@@ -23024,7 +22838,7 @@
           <w:rFonts w:ascii="Roboto Mono" w:hAnsi="Roboto Mono"/>
         </w:rPr>
         <w:pict w14:anchorId="45301BEE">
-          <v:rect id="_x0000_i1605" style="width:0;height:1.5pt" o:hralign="center" o:hrstd="t" o:hr="t" fillcolor="#a0a0a0" stroked="f"/>
+          <v:rect id="_x0000_i1065" style="width:0;height:1.5pt" o:hralign="center" o:hrstd="t" o:hr="t" fillcolor="#a0a0a0" stroked="f"/>
         </w:pict>
       </w:r>
     </w:p>
@@ -23036,120 +22850,121 @@
         <w:rPr>
           <w:rFonts w:ascii="Segoe UI Emoji" w:hAnsi="Segoe UI Emoji" w:cs="Segoe UI Emoji"/>
         </w:rPr>
+        <w:t>🧪</w:t>
+      </w:r>
+      <w:r>
+        <w:t xml:space="preserve"> What You Can Test</w:t>
+      </w:r>
+    </w:p>
+    <w:p>
+      <w:r>
+        <w:rPr>
+          <w:rFonts w:ascii="Arial" w:hAnsi="Arial"/>
+          <w:b/>
+          <w:color w:val="000000"/>
+          <w:sz w:val="18"/>
+          <w:highlight w:val="lightGray"/>
+        </w:rPr>
+        <w:t># Source: AI Source: Provided by: [Data Path</w:t>
+      </w:r>
+      <w:r>
+        <w:rPr>
+          <w:rFonts w:ascii="Arial" w:hAnsi="Arial"/>
+          <w:color w:val="000000"/>
+          <w:sz w:val="18"/>
+          <w:highlight w:val="lightGray"/>
+        </w:rPr>
+        <w:t xml:space="preserve">: Persons Table -&gt; ID Column: 1, </w:t>
+      </w:r>
+      <w:proofErr w:type="spellStart"/>
+      <w:r>
+        <w:rPr>
+          <w:rFonts w:ascii="Arial" w:hAnsi="Arial"/>
+          <w:color w:val="000000"/>
+          <w:sz w:val="18"/>
+          <w:highlight w:val="lightGray"/>
+        </w:rPr>
+        <w:t>Name_En</w:t>
+      </w:r>
+      <w:proofErr w:type="spellEnd"/>
+      <w:r>
+        <w:rPr>
+          <w:rFonts w:ascii="Arial" w:hAnsi="Arial"/>
+          <w:color w:val="000000"/>
+          <w:sz w:val="18"/>
+          <w:highlight w:val="lightGray"/>
+        </w:rPr>
+        <w:t xml:space="preserve"> Column: Motasem Essam] -&gt; </w:t>
+      </w:r>
+      <w:r>
+        <w:rPr>
+          <w:rFonts w:ascii="Arial" w:hAnsi="Arial"/>
+          <w:b/>
+          <w:color w:val="000000"/>
+          <w:sz w:val="18"/>
+          <w:highlight w:val="lightGray"/>
+        </w:rPr>
+        <w:t>From:</w:t>
+      </w:r>
+      <w:r>
+        <w:rPr>
+          <w:rFonts w:ascii="Arial" w:hAnsi="Arial"/>
+          <w:color w:val="000000"/>
+          <w:sz w:val="18"/>
+          <w:highlight w:val="lightGray"/>
+        </w:rPr>
+        <w:t xml:space="preserve"> [</w:t>
+      </w:r>
+      <w:r>
+        <w:rPr>
+          <w:rFonts w:ascii="Arial" w:eastAsia="Arial" w:hAnsi="Arial" w:cs="Arial"/>
+          <w:color w:val="000000"/>
+          <w:sz w:val="18"/>
+          <w:highlight w:val="lightGray"/>
+        </w:rPr>
+        <w:t>ChatGPT</w:t>
+      </w:r>
+      <w:r>
+        <w:rPr>
+          <w:rFonts w:ascii="Arial" w:hAnsi="Arial"/>
+          <w:color w:val="000000"/>
+          <w:sz w:val="18"/>
+          <w:highlight w:val="lightGray"/>
+        </w:rPr>
+        <w:t xml:space="preserve">] </w:t>
+      </w:r>
+      <w:r>
+        <w:rPr>
+          <w:rFonts w:ascii="Arial" w:hAnsi="Arial"/>
+          <w:b/>
+          <w:color w:val="000000"/>
+          <w:sz w:val="18"/>
+          <w:highlight w:val="lightGray"/>
+        </w:rPr>
+        <w:t>on</w:t>
+      </w:r>
+      <w:r>
+        <w:rPr>
+          <w:rFonts w:ascii="Arial" w:hAnsi="Arial"/>
+          <w:color w:val="000000"/>
+          <w:sz w:val="18"/>
+          <w:highlight w:val="lightGray"/>
+        </w:rPr>
+        <w:t xml:space="preserve"> [5/6/2026]</w:t>
+      </w:r>
+    </w:p>
+    <w:p>
+      <w:pPr>
+        <w:rPr>
+          <w:rFonts w:ascii="Roboto Mono" w:hAnsi="Roboto Mono"/>
+        </w:rPr>
+      </w:pPr>
+      <w:r>
+        <w:rPr>
+          <w:rFonts w:ascii="Roboto Mono" w:hAnsi="Roboto Mono"/>
+          <w:noProof/>
+        </w:rPr>
         <w:lastRenderedPageBreak/>
-        <w:t>🧪</w:t>
-      </w:r>
-      <w:r>
-        <w:t xml:space="preserve"> What You Can Test</w:t>
-      </w:r>
-    </w:p>
-    <w:p>
-      <w:r>
-        <w:rPr>
-          <w:rFonts w:ascii="Arial" w:hAnsi="Arial"/>
-          <w:b/>
-          <w:color w:val="000000"/>
-          <w:sz w:val="18"/>
-          <w:highlight w:val="lightGray"/>
-        </w:rPr>
-        <w:t># Source: AI Source: Provided by: [Data Path</w:t>
-      </w:r>
-      <w:r>
-        <w:rPr>
-          <w:rFonts w:ascii="Arial" w:hAnsi="Arial"/>
-          <w:color w:val="000000"/>
-          <w:sz w:val="18"/>
-          <w:highlight w:val="lightGray"/>
-        </w:rPr>
-        <w:t xml:space="preserve">: Persons Table -&gt; ID Column: 1, </w:t>
-      </w:r>
-      <w:proofErr w:type="spellStart"/>
-      <w:r>
-        <w:rPr>
-          <w:rFonts w:ascii="Arial" w:hAnsi="Arial"/>
-          <w:color w:val="000000"/>
-          <w:sz w:val="18"/>
-          <w:highlight w:val="lightGray"/>
-        </w:rPr>
-        <w:t>Name_En</w:t>
-      </w:r>
-      <w:proofErr w:type="spellEnd"/>
-      <w:r>
-        <w:rPr>
-          <w:rFonts w:ascii="Arial" w:hAnsi="Arial"/>
-          <w:color w:val="000000"/>
-          <w:sz w:val="18"/>
-          <w:highlight w:val="lightGray"/>
-        </w:rPr>
-        <w:t xml:space="preserve"> Column: Motasem Essam] -&gt; </w:t>
-      </w:r>
-      <w:r>
-        <w:rPr>
-          <w:rFonts w:ascii="Arial" w:hAnsi="Arial"/>
-          <w:b/>
-          <w:color w:val="000000"/>
-          <w:sz w:val="18"/>
-          <w:highlight w:val="lightGray"/>
-        </w:rPr>
-        <w:t>From:</w:t>
-      </w:r>
-      <w:r>
-        <w:rPr>
-          <w:rFonts w:ascii="Arial" w:hAnsi="Arial"/>
-          <w:color w:val="000000"/>
-          <w:sz w:val="18"/>
-          <w:highlight w:val="lightGray"/>
-        </w:rPr>
-        <w:t xml:space="preserve"> [</w:t>
-      </w:r>
-      <w:r>
-        <w:rPr>
-          <w:rFonts w:ascii="Arial" w:eastAsia="Arial" w:hAnsi="Arial" w:cs="Arial"/>
-          <w:color w:val="000000"/>
-          <w:sz w:val="18"/>
-          <w:highlight w:val="lightGray"/>
-        </w:rPr>
-        <w:t>ChatGPT</w:t>
-      </w:r>
-      <w:r>
-        <w:rPr>
-          <w:rFonts w:ascii="Arial" w:hAnsi="Arial"/>
-          <w:color w:val="000000"/>
-          <w:sz w:val="18"/>
-          <w:highlight w:val="lightGray"/>
-        </w:rPr>
-        <w:t xml:space="preserve">] </w:t>
-      </w:r>
-      <w:r>
-        <w:rPr>
-          <w:rFonts w:ascii="Arial" w:hAnsi="Arial"/>
-          <w:b/>
-          <w:color w:val="000000"/>
-          <w:sz w:val="18"/>
-          <w:highlight w:val="lightGray"/>
-        </w:rPr>
-        <w:t>on</w:t>
-      </w:r>
-      <w:r>
-        <w:rPr>
-          <w:rFonts w:ascii="Arial" w:hAnsi="Arial"/>
-          <w:color w:val="000000"/>
-          <w:sz w:val="18"/>
-          <w:highlight w:val="lightGray"/>
-        </w:rPr>
-        <w:t xml:space="preserve"> [5/6/2026]</w:t>
-      </w:r>
-    </w:p>
-    <w:p>
-      <w:pPr>
-        <w:rPr>
-          <w:rFonts w:ascii="Roboto Mono" w:hAnsi="Roboto Mono"/>
-        </w:rPr>
-      </w:pPr>
-      <w:r>
-        <w:rPr>
-          <w:rFonts w:ascii="Roboto Mono" w:hAnsi="Roboto Mono"/>
-        </w:rPr>
         <w:drawing>
           <wp:inline distT="0" distB="0" distL="0" distR="0" wp14:anchorId="61AC5C37" wp14:editId="67F2C2BD">
             <wp:extent cx="5943600" cy="3963670"/>
@@ -23209,9 +23024,10 @@
       <w:r>
         <w:rPr>
           <w:rFonts w:ascii="Roboto Mono" w:hAnsi="Roboto Mono"/>
+          <w:noProof/>
         </w:rPr>
         <w:drawing>
-          <wp:inline distT="0" distB="0" distL="0" distR="0" wp14:anchorId="2C5A9342" wp14:editId="313C8DE7">
+          <wp:inline distT="0" distB="0" distL="0" distR="0" wp14:anchorId="2C5A9342" wp14:editId="4647BD63">
             <wp:extent cx="5943600" cy="3343275"/>
             <wp:effectExtent l="0" t="0" r="0" b="9525"/>
             <wp:docPr id="2135797907" name="Picture 39"/>
@@ -23269,6 +23085,7 @@
       <w:r>
         <w:rPr>
           <w:rFonts w:ascii="Roboto Mono" w:hAnsi="Roboto Mono"/>
+          <w:noProof/>
         </w:rPr>
         <w:lastRenderedPageBreak/>
         <w:drawing>
@@ -23868,7 +23685,7 @@
           <w:rFonts w:ascii="Roboto Mono" w:hAnsi="Roboto Mono"/>
         </w:rPr>
         <w:pict w14:anchorId="2C8F4C3C">
-          <v:rect id="_x0000_i1609" style="width:0;height:1.5pt" o:hralign="center" o:hrstd="t" o:hr="t" fillcolor="#a0a0a0" stroked="f"/>
+          <v:rect id="_x0000_i1066" style="width:0;height:1.5pt" o:hralign="center" o:hrstd="t" o:hr="t" fillcolor="#a0a0a0" stroked="f"/>
         </w:pict>
       </w:r>
     </w:p>
@@ -24027,7 +23844,7 @@
           <w:rFonts w:ascii="Roboto Mono" w:hAnsi="Roboto Mono"/>
         </w:rPr>
         <w:pict w14:anchorId="29F0B928">
-          <v:rect id="_x0000_i1611" style="width:0;height:1.5pt" o:hralign="center" o:hrstd="t" o:hr="t" fillcolor="#a0a0a0" stroked="f"/>
+          <v:rect id="_x0000_i1067" style="width:0;height:1.5pt" o:hralign="center" o:hrstd="t" o:hr="t" fillcolor="#a0a0a0" stroked="f"/>
         </w:pict>
       </w:r>
     </w:p>
@@ -24172,7 +23989,7 @@
           <w:rFonts w:ascii="Roboto Mono" w:hAnsi="Roboto Mono"/>
         </w:rPr>
         <w:pict w14:anchorId="12FC0D26">
-          <v:rect id="_x0000_i1612" style="width:0;height:1.5pt" o:hralign="center" o:hrstd="t" o:hr="t" fillcolor="#a0a0a0" stroked="f"/>
+          <v:rect id="_x0000_i1068" style="width:0;height:1.5pt" o:hralign="center" o:hrstd="t" o:hr="t" fillcolor="#a0a0a0" stroked="f"/>
         </w:pict>
       </w:r>
     </w:p>
@@ -24317,7 +24134,7 @@
           <w:rFonts w:ascii="Roboto Mono" w:hAnsi="Roboto Mono"/>
         </w:rPr>
         <w:pict w14:anchorId="6A912792">
-          <v:rect id="_x0000_i1613" style="width:0;height:1.5pt" o:hralign="center" o:hrstd="t" o:hr="t" fillcolor="#a0a0a0" stroked="f"/>
+          <v:rect id="_x0000_i1069" style="width:0;height:1.5pt" o:hralign="center" o:hrstd="t" o:hr="t" fillcolor="#a0a0a0" stroked="f"/>
         </w:pict>
       </w:r>
     </w:p>
@@ -24462,7 +24279,7 @@
           <w:rFonts w:ascii="Roboto Mono" w:hAnsi="Roboto Mono"/>
         </w:rPr>
         <w:pict w14:anchorId="5DA7F1CA">
-          <v:rect id="_x0000_i1614" style="width:0;height:1.5pt" o:hralign="center" o:hrstd="t" o:hr="t" fillcolor="#a0a0a0" stroked="f"/>
+          <v:rect id="_x0000_i1070" style="width:0;height:1.5pt" o:hralign="center" o:hrstd="t" o:hr="t" fillcolor="#a0a0a0" stroked="f"/>
         </w:pict>
       </w:r>
     </w:p>
@@ -24755,7 +24572,7 @@
           <w:rFonts w:ascii="Roboto Mono" w:hAnsi="Roboto Mono"/>
         </w:rPr>
         <w:pict w14:anchorId="6F359CD7">
-          <v:rect id="_x0000_i1034" style="width:0;height:1.5pt" o:hralign="center" o:hrstd="t" o:hr="t" fillcolor="#a0a0a0" stroked="f"/>
+          <v:rect id="_x0000_i1071" style="width:0;height:1.5pt" o:hralign="center" o:hrstd="t" o:hr="t" fillcolor="#a0a0a0" stroked="f"/>
         </w:pict>
       </w:r>
     </w:p>
@@ -24900,7 +24717,7 @@
           <w:rFonts w:ascii="Roboto Mono" w:hAnsi="Roboto Mono"/>
         </w:rPr>
         <w:pict w14:anchorId="76CED94A">
-          <v:rect id="_x0000_i1035" style="width:0;height:1.5pt" o:hralign="center" o:hrstd="t" o:hr="t" fillcolor="#a0a0a0" stroked="f"/>
+          <v:rect id="_x0000_i1072" style="width:0;height:1.5pt" o:hralign="center" o:hrstd="t" o:hr="t" fillcolor="#a0a0a0" stroked="f"/>
         </w:pict>
       </w:r>
     </w:p>
@@ -25045,7 +24862,7 @@
           <w:rFonts w:ascii="Roboto Mono" w:hAnsi="Roboto Mono"/>
         </w:rPr>
         <w:pict w14:anchorId="7872EF61">
-          <v:rect id="_x0000_i1036" style="width:0;height:1.5pt" o:hralign="center" o:hrstd="t" o:hr="t" fillcolor="#a0a0a0" stroked="f"/>
+          <v:rect id="_x0000_i1073" style="width:0;height:1.5pt" o:hralign="center" o:hrstd="t" o:hr="t" fillcolor="#a0a0a0" stroked="f"/>
         </w:pict>
       </w:r>
     </w:p>
@@ -28253,6 +28070,7 @@
   <w:style w:type="character" w:default="1" w:styleId="DefaultParagraphFont">
     <w:name w:val="Default Paragraph Font"/>
     <w:uiPriority w:val="1"/>
+    <w:semiHidden/>
     <w:unhideWhenUsed/>
   </w:style>
   <w:style w:type="table" w:default="1" w:styleId="TableNormal">

</xml_diff>